<commit_message>
GitHub inventory: second search (addresses, domain, project names)
Claude-Session: https://claude.ai/code/session_01VCh7XeJpj5JpCzQtSzh7gK
</commit_message>
<xml_diff>
--- a/GITHUB_INVENTORY_2026-10-21/00_START_HERE_GitHub_Inventory.docx
+++ b/GITHUB_INVENTORY_2026-10-21/00_START_HERE_GitHub_Inventory.docx
@@ -808,6 +808,129 @@
       </w:tr>
     </w:tbl>
     <w:p/>
+    <w:p>
+      <w:pPr>
+        <w:pStyle w:val="Heading2"/>
+      </w:pPr>
+      <w:r>
+        <w:t>Second search (21 October 2026, the owner's addresses and project names)</w:t>
+      </w:r>
+    </w:p>
+    <w:p>
+      <w:r>
+        <w:t>Searched, as the owner asked: the owner's three Gmail addresses, the echosofalara.com domain, and the project names Echoes of Alara, Earth Swarm, SaCoLu, Veridan and Nexus.</w:t>
+      </w:r>
+    </w:p>
+    <w:p>
+      <w:pPr>
+        <w:pStyle w:val="ListBullet"/>
+      </w:pPr>
+      <w:r>
+        <w:rPr>
+          <w:b/>
+        </w:rPr>
+        <w:t>The three email addresses:</w:t>
+      </w:r>
+      <w:r>
+        <w:t xml:space="preserve"> found on no public web page.</w:t>
+      </w:r>
+    </w:p>
+    <w:p>
+      <w:pPr>
+        <w:pStyle w:val="ListBullet"/>
+      </w:pPr>
+      <w:r>
+        <w:rPr>
+          <w:b/>
+        </w:rPr>
+        <w:t>echosofalara.com / Echoes of Alara:</w:t>
+      </w:r>
+      <w:r>
+        <w:t xml:space="preserve"> the site did not appear in search results. It may be new, unindexed, or not linked from anywhere yet.</w:t>
+      </w:r>
+    </w:p>
+    <w:p>
+      <w:pPr>
+        <w:pStyle w:val="ListBullet"/>
+      </w:pPr>
+      <w:r>
+        <w:rPr>
+          <w:b/>
+        </w:rPr>
+        <w:t>SaCoLu, Veridan, Earth Swarm:</w:t>
+      </w:r>
+      <w:r>
+        <w:t xml:space="preserve"> no public page under these names was found. Only unrelated items came up (other "contextual logic" papers, ESA's Swarm satellites, Ethereum's Swarm).</w:t>
+      </w:r>
+    </w:p>
+    <w:p>
+      <w:pPr>
+        <w:pStyle w:val="ListBullet"/>
+      </w:pPr>
+      <w:r>
+        <w:rPr>
+          <w:b/>
+        </w:rPr>
+        <w:t>Leads that may or may not be the owner's (not confirmed):</w:t>
+      </w:r>
+    </w:p>
+    <w:p>
+      <w:pPr>
+        <w:pStyle w:val="ListBullet2"/>
+      </w:pPr>
+      <w:r>
+        <w:t xml:space="preserve">GitHub account </w:t>
+      </w:r>
+      <w:r>
+        <w:rPr>
+          <w:rFonts w:ascii="Courier New" w:hAnsi="Courier New"/>
+        </w:rPr>
+        <w:t>Garrettc123</w:t>
+      </w:r>
+      <w:r>
+        <w:t xml:space="preserve">, repository </w:t>
+      </w:r>
+      <w:r>
+        <w:rPr>
+          <w:rFonts w:ascii="Courier New" w:hAnsi="Courier New"/>
+        </w:rPr>
+        <w:t>NEXUS-AI-CORE</w:t>
+      </w:r>
+      <w:r>
+        <w:t xml:space="preserve"> ("NEXUS: Autonomous AI Commerce &amp; Real Estate Intelligence Engine by Garcar Enterprise"): https://github.com/Garrettc123/NEXUS-AI-CORE</w:t>
+      </w:r>
+    </w:p>
+    <w:p>
+      <w:pPr>
+        <w:pStyle w:val="ListBullet2"/>
+      </w:pPr>
+      <w:r>
+        <w:t xml:space="preserve">Scratch user </w:t>
+      </w:r>
+      <w:r>
+        <w:rPr>
+          <w:rFonts w:ascii="Courier New" w:hAnsi="Courier New"/>
+        </w:rPr>
+        <w:t>garrettg28</w:t>
+      </w:r>
+      <w:r>
+        <w:t>: https://scratch.mit.edu/users/garrettg28</w:t>
+      </w:r>
+    </w:p>
+    <w:p>
+      <w:pPr>
+        <w:pStyle w:val="ListBullet"/>
+      </w:pPr>
+      <w:r>
+        <w:rPr>
+          <w:b/>
+        </w:rPr>
+        <w:t>Limit:</w:t>
+      </w:r>
+      <w:r>
+        <w:t xml:space="preserve"> web search only shows what search engines have indexed. Pages behind logins, new sites, and private repositories don't show up.</w:t>
+      </w:r>
+    </w:p>
     <w:sectPr>
       <w:pgSz w:w="12240" w:h="15840"/>
       <w:pgMar w:top="1440" w:right="1800" w:bottom="1440" w:left="1800" w:header="720" w:footer="720" w:gutter="0"/>

</xml_diff>

<commit_message>
GitHub inventory: Tenir_5 and Solidus searches
Claude-Session: https://claude.ai/code/session_01VCh7XeJpj5JpCzQtSzh7gK
</commit_message>
<xml_diff>
--- a/GITHUB_INVENTORY_2026-10-21/00_START_HERE_GitHub_Inventory.docx
+++ b/GITHUB_INVENTORY_2026-10-21/00_START_HERE_GitHub_Inventory.docx
@@ -931,6 +931,33 @@
         <w:t xml:space="preserve"> web search only shows what search engines have indexed. Pages behind logins, new sites, and private repositories don't show up.</w:t>
       </w:r>
     </w:p>
+    <w:p>
+      <w:pPr>
+        <w:pStyle w:val="ListBullet"/>
+      </w:pPr>
+      <w:r>
+        <w:rPr>
+          <w:b/>
+        </w:rPr>
+        <w:t>Tenir_5 and Solidus (third search):</w:t>
+      </w:r>
+    </w:p>
+    <w:p>
+      <w:pPr>
+        <w:pStyle w:val="ListBullet2"/>
+      </w:pPr>
+      <w:r>
+        <w:t>Nothing public found for "Tenir_5".</w:t>
+      </w:r>
+    </w:p>
+    <w:p>
+      <w:pPr>
+        <w:pStyle w:val="ListBullet2"/>
+      </w:pPr>
+      <w:r>
+        <w:t>"Solidus" returns only an unrelated crypto company, Solidus AI Tech (AITECH token, led by Paul Farhi), with no link to the owner.</w:t>
+      </w:r>
+    </w:p>
     <w:sectPr>
       <w:pgSz w:w="12240" w:h="15840"/>
       <w:pgMar w:top="1440" w:right="1800" w:bottom="1440" w:left="1800" w:header="720" w:footer="720" w:gutter="0"/>

</xml_diff>

<commit_message>
GitHub inventory: owner's files and the Garrettc123 account
Claude-Session: https://claude.ai/code/session_01VCh7XeJpj5JpCzQtSzh7gK
</commit_message>
<xml_diff>
--- a/GITHUB_INVENTORY_2026-10-21/00_START_HERE_GitHub_Inventory.docx
+++ b/GITHUB_INVENTORY_2026-10-21/00_START_HERE_GitHub_Inventory.docx
@@ -958,6 +958,261 @@
         <w:t>"Solidus" returns only an unrelated crypto company, Solidus AI Tech (AITECH token, led by Paul Farhi), with no link to the owner.</w:t>
       </w:r>
     </w:p>
+    <w:p>
+      <w:pPr>
+        <w:pStyle w:val="Heading2"/>
+      </w:pPr>
+      <w:r>
+        <w:t>Fourth check (21 October 2026): the owner's files, and the Garrettc123 account</w:t>
+      </w:r>
+    </w:p>
+    <w:p>
+      <w:r>
+        <w:rPr>
+          <w:b/>
+        </w:rPr>
+        <w:t>The owner's own files</w:t>
+      </w:r>
+      <w:r>
+        <w:t xml:space="preserve"> (uploaded to this session) name these projects:</w:t>
+      </w:r>
+    </w:p>
+    <w:p>
+      <w:pPr>
+        <w:pStyle w:val="ListBullet"/>
+      </w:pPr>
+      <w:r>
+        <w:rPr>
+          <w:b/>
+        </w:rPr>
+        <w:t>SaCoLu:</w:t>
+      </w:r>
+      <w:r>
+        <w:t xml:space="preserve"> an AI personality design drawn from looking after plants (joy at growth, adjusting to distress, valuing effort, care without simulated emotion).</w:t>
+      </w:r>
+    </w:p>
+    <w:p>
+      <w:pPr>
+        <w:pStyle w:val="ListBullet"/>
+      </w:pPr>
+      <w:r>
+        <w:rPr>
+          <w:b/>
+        </w:rPr>
+        <w:t>Echo Key:</w:t>
+      </w:r>
+      <w:r>
+        <w:t xml:space="preserve"> a project tracker and notebook, and a data collection and transparency framework.</w:t>
+      </w:r>
+    </w:p>
+    <w:p>
+      <w:pPr>
+        <w:pStyle w:val="ListBullet"/>
+      </w:pPr>
+      <w:r>
+        <w:rPr>
+          <w:b/>
+        </w:rPr>
+        <w:t>Alara:</w:t>
+      </w:r>
+      <w:r>
+        <w:t xml:space="preserve"> a psychological and technical architecture document.</w:t>
+      </w:r>
+    </w:p>
+    <w:p>
+      <w:pPr>
+        <w:pStyle w:val="ListBullet"/>
+      </w:pPr>
+      <w:r>
+        <w:rPr>
+          <w:b/>
+        </w:rPr>
+        <w:t>EBEC:</w:t>
+      </w:r>
+      <w:r>
+        <w:t xml:space="preserve"> a reconstruction file.</w:t>
+      </w:r>
+    </w:p>
+    <w:p>
+      <w:pPr>
+        <w:pStyle w:val="ListBullet"/>
+      </w:pPr>
+      <w:r>
+        <w:rPr>
+          <w:b/>
+        </w:rPr>
+        <w:t>AI Office:</w:t>
+      </w:r>
+      <w:r>
+        <w:t xml:space="preserve"> a database setup script (a public Claude artifact, July 2025).</w:t>
+      </w:r>
+    </w:p>
+    <w:p>
+      <w:pPr>
+        <w:pStyle w:val="ListBullet"/>
+      </w:pPr>
+      <w:r>
+        <w:rPr>
+          <w:b/>
+        </w:rPr>
+        <w:t>Single-project app template:</w:t>
+      </w:r>
+      <w:r>
+        <w:t xml:space="preserve"> a data-collector "bones" app in React.</w:t>
+      </w:r>
+    </w:p>
+    <w:p>
+      <w:pPr>
+        <w:pStyle w:val="ListBullet"/>
+      </w:pPr>
+      <w:r>
+        <w:rPr>
+          <w:b/>
+        </w:rPr>
+        <w:t>Other files:</w:t>
+      </w:r>
+      <w:r>
+        <w:t xml:space="preserve"> a maintenance report template, and the AI helper mini booklets.</w:t>
+      </w:r>
+    </w:p>
+    <w:p>
+      <w:pPr>
+        <w:pStyle w:val="ListBullet"/>
+      </w:pPr>
+      <w:r>
+        <w:rPr>
+          <w:b/>
+        </w:rPr>
+        <w:t>PanelBot:</w:t>
+      </w:r>
+      <w:r>
+        <w:t xml:space="preserve"> a modular-construction design report. </w:t>
+      </w:r>
+      <w:r>
+        <w:rPr>
+          <w:b/>
+        </w:rPr>
+        <w:t>Note: that file credits a different person as its author.</w:t>
+      </w:r>
+    </w:p>
+    <w:p>
+      <w:r>
+        <w:rPr>
+          <w:b/>
+        </w:rPr>
+        <w:t>On GitHub:</w:t>
+      </w:r>
+    </w:p>
+    <w:p>
+      <w:pPr>
+        <w:pStyle w:val="ListBullet"/>
+      </w:pPr>
+      <w:r>
+        <w:t xml:space="preserve">None of these project names appears in </w:t>
+      </w:r>
+      <w:r>
+        <w:rPr>
+          <w:rFonts w:ascii="Courier New" w:hAnsi="Courier New"/>
+        </w:rPr>
+        <w:t>croblade47/utensil-theories-transfer-protocol</w:t>
+      </w:r>
+      <w:r>
+        <w:t xml:space="preserve"> (except references inside the research record).</w:t>
+      </w:r>
+    </w:p>
+    <w:p>
+      <w:pPr>
+        <w:pStyle w:val="ListBullet"/>
+      </w:pPr>
+      <w:r>
+        <w:t xml:space="preserve">None appears in the </w:t>
+      </w:r>
+      <w:r>
+        <w:rPr>
+          <w:rFonts w:ascii="Courier New" w:hAnsi="Courier New"/>
+        </w:rPr>
+        <w:t>Garrettc123</w:t>
+      </w:r>
+      <w:r>
+        <w:t xml:space="preserve"> hub repository either.</w:t>
+      </w:r>
+    </w:p>
+    <w:p>
+      <w:r>
+        <w:rPr>
+          <w:b/>
+        </w:rPr>
+        <w:t>The Garrettc123 account</w:t>
+      </w:r>
+      <w:r>
+        <w:t xml:space="preserve"> ("Garcar Enterprise"):</w:t>
+      </w:r>
+    </w:p>
+    <w:p>
+      <w:pPr>
+        <w:pStyle w:val="ListBullet"/>
+      </w:pPr>
+      <w:r>
+        <w:rPr>
+          <w:b/>
+        </w:rPr>
+        <w:t>What it is:</w:t>
+      </w:r>
+      <w:r>
+        <w:t xml:space="preserve"> a large public set of business-automation repositories, created from December 2025 on. Its hub links 76 repositories, among them NEXUS-AI-CORE, APEX, autonomous-orchestrator-core, garcar-payments, process-copilot and zeus-dashboard.</w:t>
+      </w:r>
+    </w:p>
+    <w:p>
+      <w:pPr>
+        <w:pStyle w:val="ListBullet"/>
+      </w:pPr>
+      <w:r>
+        <w:rPr>
+          <w:b/>
+        </w:rPr>
+        <w:t>The owner says this account is theirs.</w:t>
+      </w:r>
+      <w:r>
+        <w:t xml:space="preserve"> But its commits are signed with a </w:t>
+      </w:r>
+      <w:r>
+        <w:rPr>
+          <w:b/>
+        </w:rPr>
+        <w:t>different full name and a different email address</w:t>
+      </w:r>
+      <w:r>
+        <w:t xml:space="preserve"> from the owner's, and none of the owner's project names (SaCoLu, Echo Key, Alara, Earth Swarm, Veridan) appears in it.</w:t>
+      </w:r>
+    </w:p>
+    <w:p>
+      <w:pPr>
+        <w:pStyle w:val="ListBullet"/>
+      </w:pPr>
+      <w:r>
+        <w:rPr>
+          <w:b/>
+        </w:rPr>
+        <w:t>So ownership is not confirmed</w:t>
+      </w:r>
+      <w:r>
+        <w:t xml:space="preserve"> by what is public. The owner can confirm it by signing in to GitHub as Garrettc123, or by checking that account's email settings.</w:t>
+      </w:r>
+    </w:p>
+    <w:p>
+      <w:pPr>
+        <w:pStyle w:val="ListBullet"/>
+      </w:pPr>
+      <w:r>
+        <w:rPr>
+          <w:b/>
+        </w:rPr>
+        <w:t>Self-reported figures:</w:t>
+      </w:r>
+      <w:r>
+        <w:t xml:space="preserve"> the READMEs claim large revenue and "zero-human" operation. These are self-reported, and its own verified inventory marks almost everything "active dev" or "built", not "production".</w:t>
+      </w:r>
+    </w:p>
     <w:sectPr>
       <w:pgSz w:w="12240" w:h="15840"/>
       <w:pgMar w:top="1440" w:right="1800" w:bottom="1440" w:left="1800" w:header="720" w:footer="720" w:gutter="0"/>

</xml_diff>

<commit_message>
GitHub inventory: personas, themes and technical work compared
Claude-Session: https://claude.ai/code/session_01VCh7XeJpj5JpCzQtSzh7gK
</commit_message>
<xml_diff>
--- a/GITHUB_INVENTORY_2026-10-21/00_START_HERE_GitHub_Inventory.docx
+++ b/GITHUB_INVENTORY_2026-10-21/00_START_HERE_GitHub_Inventory.docx
@@ -1213,6 +1213,134 @@
         <w:t xml:space="preserve"> the READMEs claim large revenue and "zero-human" operation. These are self-reported, and its own verified inventory marks almost everything "active dev" or "built", not "production".</w:t>
       </w:r>
     </w:p>
+    <w:p>
+      <w:pPr>
+        <w:pStyle w:val="Heading2"/>
+      </w:pPr>
+      <w:r>
+        <w:t>Fifth check (21 October 2026): personas, themes and technical work compared</w:t>
+      </w:r>
+    </w:p>
+    <w:p>
+      <w:r>
+        <w:rPr>
+          <w:b/>
+        </w:rPr>
+        <w:t>The owner's personas and project names</w:t>
+      </w:r>
+      <w:r>
+        <w:t xml:space="preserve"> (from the owner's own files):</w:t>
+      </w:r>
+    </w:p>
+    <w:p>
+      <w:pPr>
+        <w:pStyle w:val="ListBullet"/>
+      </w:pPr>
+      <w:r>
+        <w:t>handles "Blade" and "Nexus-Echo";</w:t>
+      </w:r>
+    </w:p>
+    <w:p>
+      <w:pPr>
+        <w:pStyle w:val="ListBullet"/>
+      </w:pPr>
+      <w:r>
+        <w:t>the SaCoLu trinity: Veridian (the architect), Lusa (the muse, who builds the "Canvas of Mythos") and Nexus (the archivist);</w:t>
+      </w:r>
+    </w:p>
+    <w:p>
+      <w:pPr>
+        <w:pStyle w:val="ListBullet"/>
+      </w:pPr>
+      <w:r>
+        <w:t>Echoes of Alara, the Echo Key, the error-encoding method and EBEC.</w:t>
+      </w:r>
+    </w:p>
+    <w:p>
+      <w:r>
+        <w:rPr>
+          <w:b/>
+        </w:rPr>
+        <w:t>What matches the Garrettc123 account:</w:t>
+      </w:r>
+    </w:p>
+    <w:p>
+      <w:pPr>
+        <w:pStyle w:val="ListBullet"/>
+      </w:pPr>
+      <w:r>
+        <w:t>shared words: "Echo" (an "Echo Revenue Flow"), "Nexus" (NEXUS-AI-CORE) and "swarm" (an adaptive sales "swarm");</w:t>
+      </w:r>
+    </w:p>
+    <w:p>
+      <w:pPr>
+        <w:pStyle w:val="ListBullet"/>
+      </w:pPr>
+      <w:r>
+        <w:t>the same mobile set-up: building and running code on an Android phone with Termux. The owner's EBEC V3/V4 ran on Termux, and the account has Termux and Pixel deployment scripts.</w:t>
+      </w:r>
+    </w:p>
+    <w:p>
+      <w:r>
+        <w:rPr>
+          <w:b/>
+        </w:rPr>
+        <w:t>What does not match:</w:t>
+      </w:r>
+    </w:p>
+    <w:p>
+      <w:pPr>
+        <w:pStyle w:val="ListBullet"/>
+      </w:pPr>
+      <w:r>
+        <w:rPr>
+          <w:b/>
+        </w:rPr>
+        <w:t>The themes.</w:t>
+      </w:r>
+      <w:r>
+        <w:t xml:space="preserve"> The owner's work is about the mind and meaning: psychology, narrative therapy, art interpretation, human error as signal, resilience, AI comprehension, and privacy-first memory. The Garrettc123 work is about money: sales leads, Stripe payments, crypto settlement, revenue dashboards and "zero-human" business automation.</w:t>
+      </w:r>
+    </w:p>
+    <w:p>
+      <w:pPr>
+        <w:pStyle w:val="ListBullet"/>
+      </w:pPr>
+      <w:r>
+        <w:rPr>
+          <w:b/>
+        </w:rPr>
+        <w:t>The vocabulary.</w:t>
+      </w:r>
+      <w:r>
+        <w:t xml:space="preserve"> Searching the account for resonance, comprehension, living memory, plants, human error, Alara, SaCoLu or Veridian found nothing.</w:t>
+      </w:r>
+    </w:p>
+    <w:p>
+      <w:pPr>
+        <w:pStyle w:val="ListBullet"/>
+      </w:pPr>
+      <w:r>
+        <w:rPr>
+          <w:b/>
+        </w:rPr>
+        <w:t>The identity.</w:t>
+      </w:r>
+      <w:r>
+        <w:t xml:space="preserve"> "Blade" and "Nexus-Echo" are the owner's recorded personas. The account's commit name is a different full name, with a different email.</w:t>
+      </w:r>
+    </w:p>
+    <w:p>
+      <w:r>
+        <w:rPr>
+          <w:b/>
+        </w:rPr>
+        <w:t>Conclusion:</w:t>
+      </w:r>
+      <w:r>
+        <w:t xml:space="preserve"> the overlap is in names and tools, not in the ideas. The public evidence does not show that Garrettc123 is the owner's. Only the owner can settle it, by signing in to that account.</w:t>
+      </w:r>
+    </w:p>
     <w:sectPr>
       <w:pgSz w:w="12240" w:h="15840"/>
       <w:pgMar w:top="1440" w:right="1800" w:bottom="1440" w:left="1800" w:header="720" w:footer="720" w:gutter="0"/>

</xml_diff>

<commit_message>
GitHub inventory: personas and AI builds found so far
Claude-Session: https://claude.ai/code/session_01VCh7XeJpj5JpCzQtSzh7gK
</commit_message>
<xml_diff>
--- a/GITHUB_INVENTORY_2026-10-21/00_START_HERE_GitHub_Inventory.docx
+++ b/GITHUB_INVENTORY_2026-10-21/00_START_HERE_GitHub_Inventory.docx
@@ -1341,6 +1341,365 @@
         <w:t xml:space="preserve"> the overlap is in names and tools, not in the ideas. The public evidence does not show that Garrettc123 is the owner's. Only the owner can settle it, by signing in to that account.</w:t>
       </w:r>
     </w:p>
+    <w:p>
+      <w:pPr>
+        <w:pStyle w:val="Heading2"/>
+      </w:pPr>
+      <w:r>
+        <w:t>Personas and AI builds (the owner's own projects; checked 21 October 2026)</w:t>
+      </w:r>
+    </w:p>
+    <w:p>
+      <w:r>
+        <w:t>The owner builds personas: AIs set up for specific tasks, like skills. They go back to 2023. Found so far:</w:t>
+      </w:r>
+    </w:p>
+    <w:tbl>
+      <w:tblPr>
+        <w:tblStyle w:val="TableGrid"/>
+        <w:tblW w:type="auto" w:w="0"/>
+        <w:tblLook w:firstColumn="1" w:firstRow="1" w:lastColumn="0" w:lastRow="0" w:noHBand="0" w:noVBand="1" w:val="04A0"/>
+      </w:tblPr>
+      <w:tblGrid>
+        <w:gridCol w:w="2160"/>
+        <w:gridCol w:w="2160"/>
+        <w:gridCol w:w="2160"/>
+        <w:gridCol w:w="2160"/>
+      </w:tblGrid>
+      <w:tr>
+        <w:tc>
+          <w:tcPr>
+            <w:tcW w:type="dxa" w:w="2160"/>
+          </w:tcPr>
+          <w:p>
+            <w:r>
+              <w:rPr>
+                <w:b/>
+              </w:rPr>
+              <w:t>Persona / build</w:t>
+            </w:r>
+          </w:p>
+        </w:tc>
+        <w:tc>
+          <w:tcPr>
+            <w:tcW w:type="dxa" w:w="2160"/>
+          </w:tcPr>
+          <w:p>
+            <w:r>
+              <w:rPr>
+                <w:b/>
+              </w:rPr>
+              <w:t>What it is</w:t>
+            </w:r>
+          </w:p>
+        </w:tc>
+        <w:tc>
+          <w:tcPr>
+            <w:tcW w:type="dxa" w:w="2160"/>
+          </w:tcPr>
+          <w:p>
+            <w:r>
+              <w:rPr>
+                <w:b/>
+              </w:rPr>
+              <w:t>Where found</w:t>
+            </w:r>
+          </w:p>
+        </w:tc>
+        <w:tc>
+          <w:tcPr>
+            <w:tcW w:type="dxa" w:w="2160"/>
+          </w:tcPr>
+          <w:p>
+            <w:r>
+              <w:rPr>
+                <w:b/>
+              </w:rPr>
+              <w:t>Date</w:t>
+            </w:r>
+          </w:p>
+        </w:tc>
+      </w:tr>
+      <w:tr>
+        <w:tc>
+          <w:tcPr>
+            <w:tcW w:type="dxa" w:w="2160"/>
+          </w:tcPr>
+          <w:p>
+            <w:r>
+              <w:t>The Pipeline Foreman (Project Tenir 5)</w:t>
+            </w:r>
+          </w:p>
+        </w:tc>
+        <w:tc>
+          <w:tcPr>
+            <w:tcW w:type="dxa" w:w="2160"/>
+          </w:tcPr>
+          <w:p>
+            <w:r>
+              <w:t>An MVP automation script, made to fund the Alara work</w:t>
+            </w:r>
+          </w:p>
+        </w:tc>
+        <w:tc>
+          <w:tcPr>
+            <w:tcW w:type="dxa" w:w="2160"/>
+          </w:tcPr>
+          <w:p>
+            <w:r>
+              <w:t>the Echo Key tracker and notebook</w:t>
+            </w:r>
+          </w:p>
+        </w:tc>
+        <w:tc>
+          <w:tcPr>
+            <w:tcW w:type="dxa" w:w="2160"/>
+          </w:tcPr>
+          <w:p>
+            <w:r>
+              <w:t>13 Dec 2025</w:t>
+            </w:r>
+          </w:p>
+        </w:tc>
+      </w:tr>
+      <w:tr>
+        <w:tc>
+          <w:tcPr>
+            <w:tcW w:type="dxa" w:w="2160"/>
+          </w:tcPr>
+          <w:p>
+            <w:r>
+              <w:t>Echo Key logging Gem and Transparency Gem</w:t>
+            </w:r>
+          </w:p>
+        </w:tc>
+        <w:tc>
+          <w:tcPr>
+            <w:tcW w:type="dxa" w:w="2160"/>
+          </w:tcPr>
+          <w:p>
+            <w:r>
+              <w:t>Two linked Gemini Gems: one tracks the conversation and drift, one lets the participant see and control their own data</w:t>
+            </w:r>
+          </w:p>
+        </w:tc>
+        <w:tc>
+          <w:tcPr>
+            <w:tcW w:type="dxa" w:w="2160"/>
+          </w:tcPr>
+          <w:p>
+            <w:r>
+              <w:t>the Echo Key data collection and transparency framework</w:t>
+            </w:r>
+          </w:p>
+        </w:tc>
+        <w:tc>
+          <w:tcPr>
+            <w:tcW w:type="dxa" w:w="2160"/>
+          </w:tcPr>
+          <w:p>
+            <w:r>
+              <w:t>2026</w:t>
+            </w:r>
+          </w:p>
+        </w:tc>
+      </w:tr>
+      <w:tr>
+        <w:tc>
+          <w:tcPr>
+            <w:tcW w:type="dxa" w:w="2160"/>
+          </w:tcPr>
+          <w:p>
+            <w:r>
+              <w:t>SaCoLu trinity: Veridian, Lusa, Nexus</w:t>
+            </w:r>
+          </w:p>
+        </w:tc>
+        <w:tc>
+          <w:tcPr>
+            <w:tcW w:type="dxa" w:w="2160"/>
+          </w:tcPr>
+          <w:p>
+            <w:r>
+              <w:t>Three cooperating AI roles: architect, muse, archivist</w:t>
+            </w:r>
+          </w:p>
+        </w:tc>
+        <w:tc>
+          <w:tcPr>
+            <w:tcW w:type="dxa" w:w="2160"/>
+          </w:tcPr>
+          <w:p>
+            <w:r>
+              <w:t>the Echo Key tracker</w:t>
+            </w:r>
+          </w:p>
+        </w:tc>
+        <w:tc>
+          <w:tcPr>
+            <w:tcW w:type="dxa" w:w="2160"/>
+          </w:tcPr>
+          <w:p>
+            <w:r>
+              <w:t>2026</w:t>
+            </w:r>
+          </w:p>
+        </w:tc>
+      </w:tr>
+      <w:tr>
+        <w:tc>
+          <w:tcPr>
+            <w:tcW w:type="dxa" w:w="2160"/>
+          </w:tcPr>
+          <w:p>
+            <w:r>
+              <w:t>Shared-room simulation (Claude skill)</w:t>
+            </w:r>
+          </w:p>
+        </w:tc>
+        <w:tc>
+          <w:tcPr>
+            <w:tcW w:type="dxa" w:w="2160"/>
+          </w:tcPr>
+          <w:p>
+            <w:r>
+              <w:t>Several AIs (Claude, Gemini, Copilot) sit at one "table", share the same files, and talk in turn until they agree</w:t>
+            </w:r>
+          </w:p>
+        </w:tc>
+        <w:tc>
+          <w:tcPr>
+            <w:tcW w:type="dxa" w:w="2160"/>
+          </w:tcPr>
+          <w:p>
+            <w:r>
+              <w:t xml:space="preserve">repository branch </w:t>
+            </w:r>
+            <w:r>
+              <w:rPr>
+                <w:rFonts w:ascii="Courier New" w:hAnsi="Courier New"/>
+              </w:rPr>
+              <w:t>ccr-e9b75f5f-6rquhp</w:t>
+            </w:r>
+          </w:p>
+        </w:tc>
+        <w:tc>
+          <w:tcPr>
+            <w:tcW w:type="dxa" w:w="2160"/>
+          </w:tcPr>
+          <w:p>
+            <w:r>
+              <w:t>11 Oct 2026</w:t>
+            </w:r>
+          </w:p>
+        </w:tc>
+      </w:tr>
+      <w:tr>
+        <w:tc>
+          <w:tcPr>
+            <w:tcW w:type="dxa" w:w="2160"/>
+          </w:tcPr>
+          <w:p>
+            <w:r>
+              <w:t>Alex</w:t>
+            </w:r>
+          </w:p>
+        </w:tc>
+        <w:tc>
+          <w:tcPr>
+            <w:tcW w:type="dxa" w:w="2160"/>
+          </w:tcPr>
+          <w:p>
+            <w:r>
+              <w:t>A persona the owner made</w:t>
+            </w:r>
+          </w:p>
+        </w:tc>
+        <w:tc>
+          <w:tcPr>
+            <w:tcW w:type="dxa" w:w="2160"/>
+          </w:tcPr>
+          <w:p>
+            <w:r>
+              <w:rPr>
+                <w:b/>
+              </w:rPr>
+              <w:t>not found</w:t>
+            </w:r>
+            <w:r>
+              <w:t xml:space="preserve"> in the uploaded files or on GitHub</w:t>
+            </w:r>
+          </w:p>
+        </w:tc>
+        <w:tc>
+          <w:tcPr>
+            <w:tcW w:type="dxa" w:w="2160"/>
+          </w:tcPr>
+          <w:p>
+            <w:r>
+              <w:t>-</w:t>
+            </w:r>
+          </w:p>
+        </w:tc>
+      </w:tr>
+      <w:tr>
+        <w:tc>
+          <w:tcPr>
+            <w:tcW w:type="dxa" w:w="2160"/>
+          </w:tcPr>
+          <w:p>
+            <w:r>
+              <w:t>Persona (project)</w:t>
+            </w:r>
+          </w:p>
+        </w:tc>
+        <w:tc>
+          <w:tcPr>
+            <w:tcW w:type="dxa" w:w="2160"/>
+          </w:tcPr>
+          <w:p>
+            <w:r>
+              <w:t>-</w:t>
+            </w:r>
+          </w:p>
+        </w:tc>
+        <w:tc>
+          <w:tcPr>
+            <w:tcW w:type="dxa" w:w="2160"/>
+          </w:tcPr>
+          <w:p>
+            <w:r>
+              <w:rPr>
+                <w:b/>
+              </w:rPr>
+              <w:t>not found</w:t>
+            </w:r>
+          </w:p>
+        </w:tc>
+        <w:tc>
+          <w:tcPr>
+            <w:tcW w:type="dxa" w:w="2160"/>
+          </w:tcPr>
+          <w:p>
+            <w:r>
+              <w:t>-</w:t>
+            </w:r>
+          </w:p>
+        </w:tc>
+      </w:tr>
+    </w:tbl>
+    <w:p/>
+    <w:p>
+      <w:r>
+        <w:rPr>
+          <w:b/>
+        </w:rPr>
+        <w:t>Why most personas aren't visible:</w:t>
+      </w:r>
+      <w:r>
+        <w:t xml:space="preserve"> personas built as Gemini Gems, ChatGPT GPTs or Claude Projects live inside those apps' accounts. They aren't on GitHub or the public web, so they can't be found from here. To inventory them, copy each one's name and instructions, or export them, and add them to this folder.</w:t>
+      </w:r>
+    </w:p>
     <w:sectPr>
       <w:pgSz w:w="12240" w:h="15840"/>
       <w:pgMar w:top="1440" w:right="1800" w:bottom="1440" w:left="1800" w:header="720" w:footer="720" w:gutter="0"/>

</xml_diff>

<commit_message>
Consolidated list of the owner's projects and personas (Drive and Gmail)
Claude-Session: https://claude.ai/code/session_01VCh7XeJpj5JpCzQtSzh7gK
</commit_message>
<xml_diff>
--- a/GITHUB_INVENTORY_2026-10-21/00_START_HERE_GitHub_Inventory.docx
+++ b/GITHUB_INVENTORY_2026-10-21/00_START_HERE_GitHub_Inventory.docx
@@ -802,6 +802,50 @@
             </w:r>
             <w:r>
               <w:t>, this folder</w:t>
+            </w:r>
+          </w:p>
+        </w:tc>
+      </w:tr>
+      <w:tr>
+        <w:tc>
+          <w:tcPr>
+            <w:tcW w:type="dxa" w:w="2880"/>
+          </w:tcPr>
+          <w:p>
+            <w:r>
+              <w:rPr>
+                <w:rFonts w:ascii="Courier New" w:hAnsi="Courier New"/>
+              </w:rPr>
+              <w:t>01_Consolidated_Projects_and_Personas.md</w:t>
+            </w:r>
+            <w:r>
+              <w:t xml:space="preserve"> / </w:t>
+            </w:r>
+            <w:r>
+              <w:rPr>
+                <w:rFonts w:ascii="Courier New" w:hAnsi="Courier New"/>
+              </w:rPr>
+              <w:t>.docx</w:t>
+            </w:r>
+          </w:p>
+        </w:tc>
+        <w:tc>
+          <w:tcPr>
+            <w:tcW w:type="dxa" w:w="2880"/>
+          </w:tcPr>
+          <w:p>
+            <w:r>
+              <w:t>Projects and personas consolidated from Drive and Gmail</w:t>
+            </w:r>
+          </w:p>
+        </w:tc>
+        <w:tc>
+          <w:tcPr>
+            <w:tcW w:type="dxa" w:w="2880"/>
+          </w:tcPr>
+          <w:p>
+            <w:r>
+              <w:t>this folder</w:t>
             </w:r>
           </w:p>
         </w:tc>

</xml_diff>